<commit_message>
Added details about "other" applicant
</commit_message>
<xml_diff>
--- a/Notes, info, and details/Details about deleted participants.docx
+++ b/Notes, info, and details/Details about deleted participants.docx
@@ -2523,7 +2523,70 @@
                 <w:lang w:val="en-US" w:eastAsia="en-GB"/>
                 <w14:ligatures w14:val="none"/>
               </w:rPr>
-              <w:t>Other (?)</w:t>
+              <w:t xml:space="preserve">Other </w:t>
+            </w:r>
+            <w:r>
+              <w:rPr>
+                <w:rFonts w:ascii="Calibri" w:eastAsia="Times New Roman" w:hAnsi="Calibri" w:cs="Calibri"/>
+                <w:kern w:val="0"/>
+                <w:lang w:val="en-US" w:eastAsia="en-GB"/>
+                <w14:ligatures w14:val="none"/>
+              </w:rPr>
+              <w:t xml:space="preserve"> – “</w:t>
+            </w:r>
+            <w:r>
+              <w:rPr>
+                <w:rFonts w:ascii="Calibri" w:eastAsia="Times New Roman" w:hAnsi="Calibri" w:cs="Calibri"/>
+                <w:kern w:val="0"/>
+                <w:lang w:eastAsia="en-GB"/>
+                <w14:ligatures w14:val="none"/>
+              </w:rPr>
+              <w:t>It looks like the singular application (224-00722-N) was excluded due to EA not being able to locate the application that they claimed to have submitted (i.e., no record of application). A bit of an anomaly, as you correctly point out.</w:t>
+            </w:r>
+            <w:r>
+              <w:rPr>
+                <w:rFonts w:ascii="Calibri" w:eastAsia="Times New Roman" w:hAnsi="Calibri" w:cs="Calibri"/>
+                <w:kern w:val="0"/>
+                <w:lang w:eastAsia="en-GB"/>
+                <w14:ligatures w14:val="none"/>
+              </w:rPr>
+              <w:t xml:space="preserve">” – </w:t>
+            </w:r>
+            <w:r>
+              <w:rPr>
+                <w:rFonts w:ascii="Calibri" w:eastAsia="Times New Roman" w:hAnsi="Calibri" w:cs="Calibri"/>
+                <w:kern w:val="0"/>
+                <w:lang w:eastAsia="en-GB"/>
+                <w14:ligatures w14:val="none"/>
+              </w:rPr>
+              <w:t xml:space="preserve">email </w:t>
+            </w:r>
+            <w:r>
+              <w:rPr>
+                <w:rFonts w:ascii="Calibri" w:eastAsia="Times New Roman" w:hAnsi="Calibri" w:cs="Calibri"/>
+                <w:kern w:val="0"/>
+                <w:lang w:eastAsia="en-GB"/>
+                <w14:ligatures w14:val="none"/>
+              </w:rPr>
+              <w:t>from R</w:t>
+            </w:r>
+            <w:r>
+              <w:rPr>
+                <w:rFonts w:ascii="Calibri" w:eastAsia="Times New Roman" w:hAnsi="Calibri" w:cs="Calibri"/>
+                <w:kern w:val="0"/>
+                <w:lang w:eastAsia="en-GB"/>
+                <w14:ligatures w14:val="none"/>
+              </w:rPr>
+              <w:t>o</w:t>
+            </w:r>
+            <w:r>
+              <w:rPr>
+                <w:rFonts w:ascii="Calibri" w:eastAsia="Times New Roman" w:hAnsi="Calibri" w:cs="Calibri"/>
+                <w:kern w:val="0"/>
+                <w:lang w:eastAsia="en-GB"/>
+                <w14:ligatures w14:val="none"/>
+              </w:rPr>
+              <w:t>b</w:t>
             </w:r>
           </w:p>
         </w:tc>

</xml_diff>